<commit_message>
feat(import đề): Backend sử lý các Endpoint scan đề (.docx, .pdf) + add đề gồm nhiều câu hỏi cùng lúc
</commit_message>
<xml_diff>
--- a/backend/de_thi_toan_ki_1.docx
+++ b/backend/de_thi_toan_ki_1.docx
@@ -102,7 +102,7 @@
         <w:rPr>
           <w:lang w:val="vi-VN"/>
         </w:rPr>
-        <w:t>4</w:t>
+        <w:t>5</w:t>
       </w:r>
       <w:r>
         <w:rPr>
@@ -142,8 +142,381 @@
         <w:rPr>
           <w:lang w:val="vi-VN"/>
         </w:rPr>
-        <w:t>Đáp án: A</w:t>
-      </w:r>
+        <w:t xml:space="preserve">Đáp án: </w:t>
+      </w:r>
+      <w:r>
+        <w:rPr>
+          <w:lang w:val="vi-VN"/>
+        </w:rPr>
+        <w:t>A,B</w:t>
+      </w:r>
+    </w:p>
+    <w:p>
+      <w:pPr>
+        <w:spacing w:line="240" w:lineRule="auto"/>
+        <w:rPr>
+          <w:rFonts w:cs="Times New Roman"/>
+          <w:sz w:val="26"/>
+          <w:szCs w:val="26"/>
+        </w:rPr>
+      </w:pPr>
+      <w:r>
+        <w:rPr>
+          <w:rFonts w:ascii="Times New Roman" w:hAnsi="Times New Roman"/>
+          <w:b/>
+          <w:color w:val="000000"/>
+          <w:sz w:val="26"/>
+          <w:szCs w:val="26"/>
+        </w:rPr>
+        <w:t xml:space="preserve">Câu 8. </w:t>
+      </w:r>
+      <w:r>
+        <w:rPr>
+          <w:rFonts w:ascii="Times New Roman" w:eastAsia="Georgia" w:hAnsi="Times New Roman" w:cs="Times New Roman"/>
+          <w:color w:val="000000"/>
+          <w:sz w:val="26"/>
+          <w:szCs w:val="26"/>
+        </w:rPr>
+        <w:t>Cách xác định nhiệt độ trong thang nhiệt độ Celsius là</w:t>
+      </w:r>
+    </w:p>
+    <w:p>
+      <w:pPr>
+        <w:tabs>
+          <w:tab w:val="left" w:pos="283"/>
+        </w:tabs>
+        <w:rPr>
+          <w:sz w:val="26"/>
+          <w:szCs w:val="26"/>
+        </w:rPr>
+      </w:pPr>
+      <w:r>
+        <w:rPr>
+          <w:rStyle w:val="YoungMixChar"/>
+          <w:b/>
+          <w:sz w:val="26"/>
+          <w:szCs w:val="26"/>
+        </w:rPr>
+        <w:tab/>
+        <w:t xml:space="preserve">A. </w:t>
+      </w:r>
+      <w:r>
+        <w:rPr>
+          <w:rFonts w:ascii="Times New Roman" w:eastAsia="Georgia" w:hAnsi="Times New Roman" w:cs="Times New Roman"/>
+          <w:color w:val="000000"/>
+          <w:sz w:val="26"/>
+          <w:szCs w:val="26"/>
+        </w:rPr>
+        <w:t xml:space="preserve">lấy nhiệt độ của nước khi đóng băng là </w:t>
+      </w:r>
+      <w:r>
+        <w:rPr>
+          <w:rFonts w:ascii="Times New Roman" w:hAnsi="Times New Roman" w:cs="Times New Roman"/>
+          <w:color w:val="000000"/>
+          <w:position w:val="-16"/>
+          <w:sz w:val="26"/>
+          <w:szCs w:val="26"/>
+        </w:rPr>
+        <w:object w:dxaOrig="720" w:dyaOrig="440" w14:anchorId="5D0983F0">
+          <v:shapetype id="_x0000_t75" coordsize="21600,21600" o:spt="75" o:preferrelative="t" path="m@4@5l@4@11@9@11@9@5xe" filled="f" stroked="f">
+            <v:stroke joinstyle="miter"/>
+            <v:formulas>
+              <v:f eqn="if lineDrawn pixelLineWidth 0"/>
+              <v:f eqn="sum @0 1 0"/>
+              <v:f eqn="sum 0 0 @1"/>
+              <v:f eqn="prod @2 1 2"/>
+              <v:f eqn="prod @3 21600 pixelWidth"/>
+              <v:f eqn="prod @3 21600 pixelHeight"/>
+              <v:f eqn="sum @0 0 1"/>
+              <v:f eqn="prod @6 1 2"/>
+              <v:f eqn="prod @7 21600 pixelWidth"/>
+              <v:f eqn="sum @8 21600 0"/>
+              <v:f eqn="prod @7 21600 pixelHeight"/>
+              <v:f eqn="sum @10 21600 0"/>
+            </v:formulas>
+            <v:path o:extrusionok="f" gradientshapeok="t" o:connecttype="rect"/>
+            <o:lock v:ext="edit" aspectratio="t"/>
+          </v:shapetype>
+          <v:shape id="_x0000_i1025" type="#_x0000_t75" style="width:36pt;height:22pt" o:ole="">
+            <v:imagedata r:id="rId5" o:title=""/>
+          </v:shape>
+          <o:OLEObject Type="Embed" ProgID="Equation.DSMT4" ShapeID="_x0000_i1025" DrawAspect="Content" ObjectID="_1838466105" r:id="rId6"/>
+        </w:object>
+      </w:r>
+      <w:r>
+        <w:rPr>
+          <w:rFonts w:ascii="Times New Roman" w:eastAsia="Georgia" w:hAnsi="Times New Roman" w:cs="Times New Roman"/>
+          <w:color w:val="000000"/>
+          <w:sz w:val="26"/>
+          <w:szCs w:val="26"/>
+        </w:rPr>
+        <w:t xml:space="preserve"> và nhiệt độ sôi của nước </w:t>
+      </w:r>
+      <w:r>
+        <w:rPr>
+          <w:rFonts w:ascii="Times New Roman" w:hAnsi="Times New Roman" w:cs="Times New Roman"/>
+          <w:color w:val="000000"/>
+          <w:position w:val="-16"/>
+          <w:sz w:val="26"/>
+          <w:szCs w:val="26"/>
+        </w:rPr>
+        <w:object w:dxaOrig="840" w:dyaOrig="440" w14:anchorId="51177B5B">
+          <v:shape id="_x0000_i1026" type="#_x0000_t75" style="width:42pt;height:22pt" o:ole="">
+            <v:imagedata r:id="rId7" o:title=""/>
+          </v:shape>
+          <o:OLEObject Type="Embed" ProgID="Equation.DSMT4" ShapeID="_x0000_i1026" DrawAspect="Content" ObjectID="_1838466106" r:id="rId8"/>
+        </w:object>
+      </w:r>
+      <w:r>
+        <w:rPr>
+          <w:rFonts w:ascii="Times New Roman" w:eastAsia="Georgia" w:hAnsi="Times New Roman" w:cs="Times New Roman"/>
+          <w:color w:val="000000"/>
+          <w:sz w:val="26"/>
+          <w:szCs w:val="26"/>
+        </w:rPr>
+        <w:t xml:space="preserve"> làm chuẩn.</w:t>
+      </w:r>
+    </w:p>
+    <w:p>
+      <w:pPr>
+        <w:tabs>
+          <w:tab w:val="left" w:pos="283"/>
+        </w:tabs>
+        <w:rPr>
+          <w:sz w:val="26"/>
+          <w:szCs w:val="26"/>
+        </w:rPr>
+      </w:pPr>
+      <w:r>
+        <w:rPr>
+          <w:rStyle w:val="YoungMixChar"/>
+          <w:b/>
+          <w:sz w:val="26"/>
+          <w:szCs w:val="26"/>
+        </w:rPr>
+        <w:tab/>
+        <w:t xml:space="preserve">B. </w:t>
+      </w:r>
+      <w:r>
+        <w:rPr>
+          <w:rFonts w:ascii="Times New Roman" w:eastAsia="Georgia" w:hAnsi="Times New Roman" w:cs="Times New Roman"/>
+          <w:color w:val="000000"/>
+          <w:sz w:val="26"/>
+          <w:szCs w:val="26"/>
+        </w:rPr>
+        <w:t xml:space="preserve">lấy nhiệt độ của nước khi đóng băng là </w:t>
+      </w:r>
+      <w:r>
+        <w:rPr>
+          <w:rFonts w:ascii="Times New Roman" w:hAnsi="Times New Roman" w:cs="Times New Roman"/>
+          <w:color w:val="000000"/>
+          <w:position w:val="-16"/>
+          <w:sz w:val="26"/>
+          <w:szCs w:val="26"/>
+        </w:rPr>
+        <w:object w:dxaOrig="720" w:dyaOrig="440" w14:anchorId="0CE444DA">
+          <v:shape id="_x0000_i1027" type="#_x0000_t75" style="width:36pt;height:22pt" o:ole="">
+            <v:imagedata r:id="rId9" o:title=""/>
+          </v:shape>
+          <o:OLEObject Type="Embed" ProgID="Equation.DSMT4" ShapeID="_x0000_i1027" DrawAspect="Content" ObjectID="_1838466107" r:id="rId10"/>
+        </w:object>
+      </w:r>
+      <w:r>
+        <w:rPr>
+          <w:rFonts w:ascii="Times New Roman" w:eastAsia="Georgia" w:hAnsi="Times New Roman" w:cs="Times New Roman"/>
+          <w:color w:val="000000"/>
+          <w:sz w:val="26"/>
+          <w:szCs w:val="26"/>
+        </w:rPr>
+        <w:t xml:space="preserve"> và nhiệt độ sôi của nước </w:t>
+      </w:r>
+      <w:r>
+        <w:rPr>
+          <w:rFonts w:ascii="Times New Roman" w:hAnsi="Times New Roman" w:cs="Times New Roman"/>
+          <w:color w:val="000000"/>
+          <w:position w:val="-16"/>
+          <w:sz w:val="26"/>
+          <w:szCs w:val="26"/>
+        </w:rPr>
+        <w:object w:dxaOrig="620" w:dyaOrig="440" w14:anchorId="2C321D2A">
+          <v:shape id="_x0000_i1028" type="#_x0000_t75" style="width:31pt;height:22pt" o:ole="">
+            <v:imagedata r:id="rId11" o:title=""/>
+          </v:shape>
+          <o:OLEObject Type="Embed" ProgID="Equation.DSMT4" ShapeID="_x0000_i1028" DrawAspect="Content" ObjectID="_1838466108" r:id="rId12"/>
+        </w:object>
+      </w:r>
+      <w:r>
+        <w:rPr>
+          <w:rFonts w:ascii="Times New Roman" w:eastAsia="Georgia" w:hAnsi="Times New Roman" w:cs="Times New Roman"/>
+          <w:color w:val="000000"/>
+          <w:sz w:val="26"/>
+          <w:szCs w:val="26"/>
+        </w:rPr>
+        <w:t xml:space="preserve"> làm chuẩn.</w:t>
+      </w:r>
+    </w:p>
+    <w:p>
+      <w:pPr>
+        <w:tabs>
+          <w:tab w:val="left" w:pos="283"/>
+        </w:tabs>
+        <w:rPr>
+          <w:sz w:val="26"/>
+          <w:szCs w:val="26"/>
+        </w:rPr>
+      </w:pPr>
+      <w:r>
+        <w:rPr>
+          <w:rStyle w:val="YoungMixChar"/>
+          <w:b/>
+          <w:sz w:val="26"/>
+          <w:szCs w:val="26"/>
+        </w:rPr>
+        <w:tab/>
+        <w:t xml:space="preserve">C. </w:t>
+      </w:r>
+      <w:r>
+        <w:rPr>
+          <w:rFonts w:ascii="Times New Roman" w:eastAsia="Georgia" w:hAnsi="Times New Roman" w:cs="Times New Roman"/>
+          <w:color w:val="000000"/>
+          <w:sz w:val="26"/>
+          <w:szCs w:val="26"/>
+        </w:rPr>
+        <w:t xml:space="preserve">lấy nhiệt độ của nước khi đóng băng là </w:t>
+      </w:r>
+      <w:r>
+        <w:rPr>
+          <w:rFonts w:ascii="Times New Roman" w:hAnsi="Times New Roman" w:cs="Times New Roman"/>
+          <w:color w:val="000000"/>
+          <w:position w:val="-16"/>
+          <w:sz w:val="26"/>
+          <w:szCs w:val="26"/>
+        </w:rPr>
+        <w:object w:dxaOrig="620" w:dyaOrig="440" w14:anchorId="1995900E">
+          <v:shape id="_x0000_i1029" type="#_x0000_t75" style="width:31pt;height:22pt" o:ole="">
+            <v:imagedata r:id="rId13" o:title=""/>
+          </v:shape>
+          <o:OLEObject Type="Embed" ProgID="Equation.DSMT4" ShapeID="_x0000_i1029" DrawAspect="Content" ObjectID="_1838466109" r:id="rId14"/>
+        </w:object>
+      </w:r>
+      <w:r>
+        <w:rPr>
+          <w:rFonts w:ascii="Times New Roman" w:eastAsia="Georgia" w:hAnsi="Times New Roman" w:cs="Times New Roman"/>
+          <w:color w:val="000000"/>
+          <w:sz w:val="26"/>
+          <w:szCs w:val="26"/>
+        </w:rPr>
+        <w:t xml:space="preserve"> và nhiệt độ sôi của nước </w:t>
+      </w:r>
+      <w:r>
+        <w:rPr>
+          <w:rFonts w:ascii="Times New Roman" w:hAnsi="Times New Roman" w:cs="Times New Roman"/>
+          <w:color w:val="000000"/>
+          <w:position w:val="-16"/>
+          <w:sz w:val="26"/>
+          <w:szCs w:val="26"/>
+        </w:rPr>
+        <w:object w:dxaOrig="840" w:dyaOrig="440" w14:anchorId="19C41A9E">
+          <v:shape id="_x0000_i1030" type="#_x0000_t75" style="width:42pt;height:22pt" o:ole="">
+            <v:imagedata r:id="rId15" o:title=""/>
+          </v:shape>
+          <o:OLEObject Type="Embed" ProgID="Equation.DSMT4" ShapeID="_x0000_i1030" DrawAspect="Content" ObjectID="_1838466110" r:id="rId16"/>
+        </w:object>
+      </w:r>
+      <w:r>
+        <w:rPr>
+          <w:rFonts w:ascii="Times New Roman" w:eastAsia="Georgia" w:hAnsi="Times New Roman" w:cs="Times New Roman"/>
+          <w:color w:val="000000"/>
+          <w:sz w:val="26"/>
+          <w:szCs w:val="26"/>
+        </w:rPr>
+        <w:t xml:space="preserve"> làm chuẩn.</w:t>
+      </w:r>
+    </w:p>
+    <w:p>
+      <w:pPr>
+        <w:tabs>
+          <w:tab w:val="left" w:pos="283"/>
+        </w:tabs>
+        <w:rPr>
+          <w:sz w:val="26"/>
+          <w:szCs w:val="26"/>
+        </w:rPr>
+      </w:pPr>
+      <w:r>
+        <w:rPr>
+          <w:rStyle w:val="YoungMixChar"/>
+          <w:b/>
+          <w:sz w:val="26"/>
+          <w:szCs w:val="26"/>
+        </w:rPr>
+        <w:tab/>
+        <w:t xml:space="preserve">D. </w:t>
+      </w:r>
+      <w:r>
+        <w:rPr>
+          <w:rFonts w:ascii="Times New Roman" w:eastAsia="Georgia" w:hAnsi="Times New Roman" w:cs="Times New Roman"/>
+          <w:color w:val="000000"/>
+          <w:sz w:val="26"/>
+          <w:szCs w:val="26"/>
+        </w:rPr>
+        <w:t xml:space="preserve">lấy nhiệt độ của nước khi đóng băng là </w:t>
+      </w:r>
+      <w:r>
+        <w:rPr>
+          <w:rFonts w:ascii="Times New Roman" w:hAnsi="Times New Roman" w:cs="Times New Roman"/>
+          <w:color w:val="000000"/>
+          <w:position w:val="-16"/>
+          <w:sz w:val="26"/>
+          <w:szCs w:val="26"/>
+        </w:rPr>
+        <w:object w:dxaOrig="840" w:dyaOrig="440" w14:anchorId="133DD55A">
+          <v:shape id="_x0000_i1031" type="#_x0000_t75" style="width:42pt;height:22pt" o:ole="">
+            <v:imagedata r:id="rId17" o:title=""/>
+          </v:shape>
+          <o:OLEObject Type="Embed" ProgID="Equation.DSMT4" ShapeID="_x0000_i1031" DrawAspect="Content" ObjectID="_1838466111" r:id="rId18"/>
+        </w:object>
+      </w:r>
+      <w:r>
+        <w:rPr>
+          <w:rFonts w:ascii="Times New Roman" w:eastAsia="Georgia" w:hAnsi="Times New Roman" w:cs="Times New Roman"/>
+          <w:color w:val="000000"/>
+          <w:sz w:val="26"/>
+          <w:szCs w:val="26"/>
+        </w:rPr>
+        <w:t xml:space="preserve"> và nhiệt độ sôi của nước </w:t>
+      </w:r>
+      <w:r>
+        <w:rPr>
+          <w:rFonts w:ascii="Times New Roman" w:hAnsi="Times New Roman" w:cs="Times New Roman"/>
+          <w:color w:val="000000"/>
+          <w:position w:val="-16"/>
+          <w:sz w:val="26"/>
+          <w:szCs w:val="26"/>
+        </w:rPr>
+        <w:object w:dxaOrig="720" w:dyaOrig="440" w14:anchorId="462E88C7">
+          <v:shape id="_x0000_i1032" type="#_x0000_t75" style="width:36pt;height:22pt" o:ole="">
+            <v:imagedata r:id="rId19" o:title=""/>
+          </v:shape>
+          <o:OLEObject Type="Embed" ProgID="Equation.DSMT4" ShapeID="_x0000_i1032" DrawAspect="Content" ObjectID="_1838466112" r:id="rId20"/>
+        </w:object>
+      </w:r>
+      <w:r>
+        <w:rPr>
+          <w:rFonts w:ascii="Times New Roman" w:eastAsia="Georgia" w:hAnsi="Times New Roman" w:cs="Times New Roman"/>
+          <w:color w:val="000000"/>
+          <w:sz w:val="26"/>
+          <w:szCs w:val="26"/>
+        </w:rPr>
+        <w:t xml:space="preserve"> làm chuẩn.</w:t>
+      </w:r>
+    </w:p>
+    <w:p>
+      <w:pPr>
+        <w:rPr>
+          <w:lang w:val="vi-VN"/>
+        </w:rPr>
+      </w:pPr>
     </w:p>
     <w:sectPr>
       <w:pgSz w:w="12240" w:h="15840"/>
@@ -1353,6 +1726,14 @@
       <w:spacing w:val="5"/>
     </w:rPr>
   </w:style>
+  <w:style w:type="character" w:customStyle="1" w:styleId="YoungMixChar">
+    <w:name w:val="YoungMix_Char"/>
+    <w:rsid w:val="003F4B9D"/>
+    <w:rPr>
+      <w:rFonts w:ascii="Times New Roman" w:hAnsi="Times New Roman"/>
+      <w:sz w:val="24"/>
+    </w:rPr>
+  </w:style>
 </w:styles>
 </file>
 

</xml_diff>

<commit_message>
feat(import đề): frontend xây dựng UI,UX cho các endpoint scan đề + add đề gồm nhiều câu hỏi cùng lúc
</commit_message>
<xml_diff>
--- a/backend/de_thi_toan_ki_1.docx
+++ b/backend/de_thi_toan_ki_1.docx
@@ -134,25 +134,6 @@
     </w:p>
     <w:p>
       <w:pPr>
-        <w:rPr>
-          <w:lang w:val="vi-VN"/>
-        </w:rPr>
-      </w:pPr>
-      <w:r>
-        <w:rPr>
-          <w:lang w:val="vi-VN"/>
-        </w:rPr>
-        <w:t xml:space="preserve">Đáp án: </w:t>
-      </w:r>
-      <w:r>
-        <w:rPr>
-          <w:lang w:val="vi-VN"/>
-        </w:rPr>
-        <w:t>A,B</w:t>
-      </w:r>
-    </w:p>
-    <w:p>
-      <w:pPr>
         <w:spacing w:line="240" w:lineRule="auto"/>
         <w:rPr>
           <w:rFonts w:cs="Times New Roman"/>
@@ -168,7 +149,27 @@
           <w:sz w:val="26"/>
           <w:szCs w:val="26"/>
         </w:rPr>
-        <w:t xml:space="preserve">Câu 8. </w:t>
+        <w:t xml:space="preserve">Câu </w:t>
+      </w:r>
+      <w:r>
+        <w:rPr>
+          <w:rFonts w:ascii="Times New Roman" w:hAnsi="Times New Roman"/>
+          <w:b/>
+          <w:color w:val="000000"/>
+          <w:sz w:val="26"/>
+          <w:szCs w:val="26"/>
+        </w:rPr>
+        <w:t>7</w:t>
+      </w:r>
+      <w:r>
+        <w:rPr>
+          <w:rFonts w:ascii="Times New Roman" w:hAnsi="Times New Roman"/>
+          <w:b/>
+          <w:color w:val="000000"/>
+          <w:sz w:val="26"/>
+          <w:szCs w:val="26"/>
+        </w:rPr>
+        <w:t xml:space="preserve">. </w:t>
       </w:r>
       <w:r>
         <w:rPr>
@@ -217,7 +218,7 @@
           <w:sz w:val="26"/>
           <w:szCs w:val="26"/>
         </w:rPr>
-        <w:object w:dxaOrig="720" w:dyaOrig="440" w14:anchorId="5D0983F0">
+        <w:object w:dxaOrig="720" w:dyaOrig="440" w14:anchorId="581B45E3">
           <v:shapetype id="_x0000_t75" coordsize="21600,21600" o:spt="75" o:preferrelative="t" path="m@4@5l@4@11@9@11@9@5xe" filled="f" stroked="f">
             <v:stroke joinstyle="miter"/>
             <v:formulas>
@@ -237,10 +238,361 @@
             <v:path o:extrusionok="f" gradientshapeok="t" o:connecttype="rect"/>
             <o:lock v:ext="edit" aspectratio="t"/>
           </v:shapetype>
+          <v:shape id="_x0000_i1081" type="#_x0000_t75" style="width:36pt;height:22pt" o:ole="">
+            <v:imagedata r:id="rId5" o:title=""/>
+          </v:shape>
+          <o:OLEObject Type="Embed" ProgID="Equation.DSMT4" ShapeID="_x0000_i1081" DrawAspect="Content" ObjectID="_1838500466" r:id="rId6"/>
+        </w:object>
+      </w:r>
+      <w:r>
+        <w:rPr>
+          <w:rFonts w:ascii="Times New Roman" w:eastAsia="Georgia" w:hAnsi="Times New Roman" w:cs="Times New Roman"/>
+          <w:color w:val="000000"/>
+          <w:sz w:val="26"/>
+          <w:szCs w:val="26"/>
+        </w:rPr>
+        <w:t xml:space="preserve"> và nhiệt độ sôi của nước </w:t>
+      </w:r>
+      <w:r>
+        <w:rPr>
+          <w:rFonts w:ascii="Times New Roman" w:hAnsi="Times New Roman" w:cs="Times New Roman"/>
+          <w:color w:val="000000"/>
+          <w:position w:val="-16"/>
+          <w:sz w:val="26"/>
+          <w:szCs w:val="26"/>
+        </w:rPr>
+        <w:object w:dxaOrig="840" w:dyaOrig="440" w14:anchorId="2954EB1C">
+          <v:shape id="_x0000_i1082" type="#_x0000_t75" style="width:42pt;height:22pt" o:ole="">
+            <v:imagedata r:id="rId7" o:title=""/>
+          </v:shape>
+          <o:OLEObject Type="Embed" ProgID="Equation.DSMT4" ShapeID="_x0000_i1082" DrawAspect="Content" ObjectID="_1838500467" r:id="rId8"/>
+        </w:object>
+      </w:r>
+      <w:r>
+        <w:rPr>
+          <w:rFonts w:ascii="Times New Roman" w:eastAsia="Georgia" w:hAnsi="Times New Roman" w:cs="Times New Roman"/>
+          <w:color w:val="000000"/>
+          <w:sz w:val="26"/>
+          <w:szCs w:val="26"/>
+        </w:rPr>
+        <w:t xml:space="preserve"> làm chuẩn.</w:t>
+      </w:r>
+    </w:p>
+    <w:p>
+      <w:pPr>
+        <w:tabs>
+          <w:tab w:val="left" w:pos="283"/>
+        </w:tabs>
+        <w:rPr>
+          <w:sz w:val="26"/>
+          <w:szCs w:val="26"/>
+        </w:rPr>
+      </w:pPr>
+      <w:r>
+        <w:rPr>
+          <w:rStyle w:val="YoungMixChar"/>
+          <w:b/>
+          <w:sz w:val="26"/>
+          <w:szCs w:val="26"/>
+        </w:rPr>
+        <w:tab/>
+        <w:t xml:space="preserve">B. </w:t>
+      </w:r>
+      <w:r>
+        <w:rPr>
+          <w:rFonts w:ascii="Times New Roman" w:eastAsia="Georgia" w:hAnsi="Times New Roman" w:cs="Times New Roman"/>
+          <w:color w:val="000000"/>
+          <w:sz w:val="26"/>
+          <w:szCs w:val="26"/>
+        </w:rPr>
+        <w:t xml:space="preserve">lấy nhiệt độ của nước khi đóng băng là </w:t>
+      </w:r>
+      <w:r>
+        <w:rPr>
+          <w:rFonts w:ascii="Times New Roman" w:hAnsi="Times New Roman" w:cs="Times New Roman"/>
+          <w:color w:val="000000"/>
+          <w:position w:val="-16"/>
+          <w:sz w:val="26"/>
+          <w:szCs w:val="26"/>
+        </w:rPr>
+        <w:object w:dxaOrig="720" w:dyaOrig="440" w14:anchorId="39CC5C40">
+          <v:shape id="_x0000_i1083" type="#_x0000_t75" style="width:36pt;height:22pt" o:ole="">
+            <v:imagedata r:id="rId9" o:title=""/>
+          </v:shape>
+          <o:OLEObject Type="Embed" ProgID="Equation.DSMT4" ShapeID="_x0000_i1083" DrawAspect="Content" ObjectID="_1838500468" r:id="rId10"/>
+        </w:object>
+      </w:r>
+      <w:r>
+        <w:rPr>
+          <w:rFonts w:ascii="Times New Roman" w:eastAsia="Georgia" w:hAnsi="Times New Roman" w:cs="Times New Roman"/>
+          <w:color w:val="000000"/>
+          <w:sz w:val="26"/>
+          <w:szCs w:val="26"/>
+        </w:rPr>
+        <w:t xml:space="preserve"> và nhiệt độ sôi của nước </w:t>
+      </w:r>
+      <w:r>
+        <w:rPr>
+          <w:rFonts w:ascii="Times New Roman" w:hAnsi="Times New Roman" w:cs="Times New Roman"/>
+          <w:color w:val="000000"/>
+          <w:position w:val="-16"/>
+          <w:sz w:val="26"/>
+          <w:szCs w:val="26"/>
+        </w:rPr>
+        <w:object w:dxaOrig="620" w:dyaOrig="440" w14:anchorId="6FFBDD3C">
+          <v:shape id="_x0000_i1084" type="#_x0000_t75" style="width:31pt;height:22pt" o:ole="">
+            <v:imagedata r:id="rId11" o:title=""/>
+          </v:shape>
+          <o:OLEObject Type="Embed" ProgID="Equation.DSMT4" ShapeID="_x0000_i1084" DrawAspect="Content" ObjectID="_1838500469" r:id="rId12"/>
+        </w:object>
+      </w:r>
+      <w:r>
+        <w:rPr>
+          <w:rFonts w:ascii="Times New Roman" w:eastAsia="Georgia" w:hAnsi="Times New Roman" w:cs="Times New Roman"/>
+          <w:color w:val="000000"/>
+          <w:sz w:val="26"/>
+          <w:szCs w:val="26"/>
+        </w:rPr>
+        <w:t xml:space="preserve"> làm chuẩn.</w:t>
+      </w:r>
+    </w:p>
+    <w:p>
+      <w:pPr>
+        <w:tabs>
+          <w:tab w:val="left" w:pos="283"/>
+        </w:tabs>
+        <w:rPr>
+          <w:sz w:val="26"/>
+          <w:szCs w:val="26"/>
+        </w:rPr>
+      </w:pPr>
+      <w:r>
+        <w:rPr>
+          <w:rStyle w:val="YoungMixChar"/>
+          <w:b/>
+          <w:sz w:val="26"/>
+          <w:szCs w:val="26"/>
+        </w:rPr>
+        <w:tab/>
+        <w:t xml:space="preserve">C. </w:t>
+      </w:r>
+      <w:r>
+        <w:rPr>
+          <w:rFonts w:ascii="Times New Roman" w:eastAsia="Georgia" w:hAnsi="Times New Roman" w:cs="Times New Roman"/>
+          <w:color w:val="000000"/>
+          <w:sz w:val="26"/>
+          <w:szCs w:val="26"/>
+        </w:rPr>
+        <w:t xml:space="preserve">lấy nhiệt độ của nước khi đóng băng là </w:t>
+      </w:r>
+      <w:r>
+        <w:rPr>
+          <w:rFonts w:ascii="Times New Roman" w:hAnsi="Times New Roman" w:cs="Times New Roman"/>
+          <w:color w:val="000000"/>
+          <w:position w:val="-16"/>
+          <w:sz w:val="26"/>
+          <w:szCs w:val="26"/>
+        </w:rPr>
+        <w:object w:dxaOrig="620" w:dyaOrig="440" w14:anchorId="2C634CC5">
+          <v:shape id="_x0000_i1085" type="#_x0000_t75" style="width:31pt;height:22pt" o:ole="">
+            <v:imagedata r:id="rId13" o:title=""/>
+          </v:shape>
+          <o:OLEObject Type="Embed" ProgID="Equation.DSMT4" ShapeID="_x0000_i1085" DrawAspect="Content" ObjectID="_1838500470" r:id="rId14"/>
+        </w:object>
+      </w:r>
+      <w:r>
+        <w:rPr>
+          <w:rFonts w:ascii="Times New Roman" w:eastAsia="Georgia" w:hAnsi="Times New Roman" w:cs="Times New Roman"/>
+          <w:color w:val="000000"/>
+          <w:sz w:val="26"/>
+          <w:szCs w:val="26"/>
+        </w:rPr>
+        <w:t xml:space="preserve"> và nhiệt độ sôi của nước </w:t>
+      </w:r>
+      <w:r>
+        <w:rPr>
+          <w:rFonts w:ascii="Times New Roman" w:hAnsi="Times New Roman" w:cs="Times New Roman"/>
+          <w:color w:val="000000"/>
+          <w:position w:val="-16"/>
+          <w:sz w:val="26"/>
+          <w:szCs w:val="26"/>
+        </w:rPr>
+        <w:object w:dxaOrig="840" w:dyaOrig="440" w14:anchorId="7884F2B6">
+          <v:shape id="_x0000_i1086" type="#_x0000_t75" style="width:42pt;height:22pt" o:ole="">
+            <v:imagedata r:id="rId15" o:title=""/>
+          </v:shape>
+          <o:OLEObject Type="Embed" ProgID="Equation.DSMT4" ShapeID="_x0000_i1086" DrawAspect="Content" ObjectID="_1838500471" r:id="rId16"/>
+        </w:object>
+      </w:r>
+      <w:r>
+        <w:rPr>
+          <w:rFonts w:ascii="Times New Roman" w:eastAsia="Georgia" w:hAnsi="Times New Roman" w:cs="Times New Roman"/>
+          <w:color w:val="000000"/>
+          <w:sz w:val="26"/>
+          <w:szCs w:val="26"/>
+        </w:rPr>
+        <w:t xml:space="preserve"> làm chuẩn.</w:t>
+      </w:r>
+    </w:p>
+    <w:p>
+      <w:pPr>
+        <w:tabs>
+          <w:tab w:val="left" w:pos="283"/>
+        </w:tabs>
+        <w:rPr>
+          <w:rFonts w:ascii="Times New Roman" w:eastAsia="Georgia" w:hAnsi="Times New Roman" w:cs="Times New Roman"/>
+          <w:color w:val="000000"/>
+          <w:sz w:val="26"/>
+          <w:szCs w:val="26"/>
+          <w:lang w:val="vi-VN"/>
+        </w:rPr>
+      </w:pPr>
+      <w:r>
+        <w:rPr>
+          <w:rStyle w:val="YoungMixChar"/>
+          <w:b/>
+          <w:sz w:val="26"/>
+          <w:szCs w:val="26"/>
+        </w:rPr>
+        <w:tab/>
+        <w:t xml:space="preserve">D. </w:t>
+      </w:r>
+      <w:r>
+        <w:rPr>
+          <w:rFonts w:ascii="Times New Roman" w:eastAsia="Georgia" w:hAnsi="Times New Roman" w:cs="Times New Roman"/>
+          <w:color w:val="000000"/>
+          <w:sz w:val="26"/>
+          <w:szCs w:val="26"/>
+        </w:rPr>
+        <w:t xml:space="preserve">lấy nhiệt độ của nước khi đóng băng là </w:t>
+      </w:r>
+      <w:r>
+        <w:rPr>
+          <w:rFonts w:ascii="Times New Roman" w:hAnsi="Times New Roman" w:cs="Times New Roman"/>
+          <w:color w:val="000000"/>
+          <w:position w:val="-16"/>
+          <w:sz w:val="26"/>
+          <w:szCs w:val="26"/>
+        </w:rPr>
+        <w:object w:dxaOrig="840" w:dyaOrig="440" w14:anchorId="1F602575">
+          <v:shape id="_x0000_i1087" type="#_x0000_t75" style="width:42pt;height:22pt" o:ole="">
+            <v:imagedata r:id="rId17" o:title=""/>
+          </v:shape>
+          <o:OLEObject Type="Embed" ProgID="Equation.DSMT4" ShapeID="_x0000_i1087" DrawAspect="Content" ObjectID="_1838500472" r:id="rId18"/>
+        </w:object>
+      </w:r>
+      <w:r>
+        <w:rPr>
+          <w:rFonts w:ascii="Times New Roman" w:eastAsia="Georgia" w:hAnsi="Times New Roman" w:cs="Times New Roman"/>
+          <w:color w:val="000000"/>
+          <w:sz w:val="26"/>
+          <w:szCs w:val="26"/>
+        </w:rPr>
+        <w:t xml:space="preserve"> và nhiệt độ sôi của nước </w:t>
+      </w:r>
+      <w:r>
+        <w:rPr>
+          <w:rFonts w:ascii="Times New Roman" w:hAnsi="Times New Roman" w:cs="Times New Roman"/>
+          <w:color w:val="000000"/>
+          <w:position w:val="-16"/>
+          <w:sz w:val="26"/>
+          <w:szCs w:val="26"/>
+        </w:rPr>
+        <w:object w:dxaOrig="720" w:dyaOrig="440" w14:anchorId="4689BE5D">
+          <v:shape id="_x0000_i1088" type="#_x0000_t75" style="width:36pt;height:22pt" o:ole="">
+            <v:imagedata r:id="rId19" o:title=""/>
+          </v:shape>
+          <o:OLEObject Type="Embed" ProgID="Equation.DSMT4" ShapeID="_x0000_i1088" DrawAspect="Content" ObjectID="_1838500473" r:id="rId20"/>
+        </w:object>
+      </w:r>
+      <w:r>
+        <w:rPr>
+          <w:rFonts w:ascii="Times New Roman" w:eastAsia="Georgia" w:hAnsi="Times New Roman" w:cs="Times New Roman"/>
+          <w:color w:val="000000"/>
+          <w:sz w:val="26"/>
+          <w:szCs w:val="26"/>
+        </w:rPr>
+        <w:t xml:space="preserve"> làm chuẩn.</w:t>
+      </w:r>
+    </w:p>
+    <w:p>
+      <w:pPr>
+        <w:rPr>
+          <w:lang w:val="vi-VN"/>
+        </w:rPr>
+      </w:pPr>
+    </w:p>
+    <w:p>
+      <w:pPr>
+        <w:spacing w:line="240" w:lineRule="auto"/>
+        <w:rPr>
+          <w:rFonts w:cs="Times New Roman"/>
+          <w:sz w:val="26"/>
+          <w:szCs w:val="26"/>
+        </w:rPr>
+      </w:pPr>
+      <w:r>
+        <w:rPr>
+          <w:rFonts w:ascii="Times New Roman" w:hAnsi="Times New Roman"/>
+          <w:b/>
+          <w:color w:val="000000"/>
+          <w:sz w:val="26"/>
+          <w:szCs w:val="26"/>
+        </w:rPr>
+        <w:t xml:space="preserve">Câu 8. </w:t>
+      </w:r>
+      <w:r>
+        <w:rPr>
+          <w:rFonts w:ascii="Times New Roman" w:eastAsia="Georgia" w:hAnsi="Times New Roman" w:cs="Times New Roman"/>
+          <w:color w:val="000000"/>
+          <w:sz w:val="26"/>
+          <w:szCs w:val="26"/>
+        </w:rPr>
+        <w:t>Cách xác định nhiệt độ trong thang nhiệt độ Celsius là</w:t>
+      </w:r>
+    </w:p>
+    <w:p>
+      <w:pPr>
+        <w:tabs>
+          <w:tab w:val="left" w:pos="283"/>
+        </w:tabs>
+        <w:rPr>
+          <w:sz w:val="26"/>
+          <w:szCs w:val="26"/>
+        </w:rPr>
+      </w:pPr>
+      <w:r>
+        <w:rPr>
+          <w:rStyle w:val="YoungMixChar"/>
+          <w:b/>
+          <w:sz w:val="26"/>
+          <w:szCs w:val="26"/>
+        </w:rPr>
+        <w:tab/>
+        <w:t xml:space="preserve">A. </w:t>
+      </w:r>
+      <w:r>
+        <w:rPr>
+          <w:rFonts w:ascii="Times New Roman" w:eastAsia="Georgia" w:hAnsi="Times New Roman" w:cs="Times New Roman"/>
+          <w:color w:val="000000"/>
+          <w:sz w:val="26"/>
+          <w:szCs w:val="26"/>
+        </w:rPr>
+        <w:t xml:space="preserve">lấy nhiệt độ của nước khi đóng băng là </w:t>
+      </w:r>
+      <w:r>
+        <w:rPr>
+          <w:rFonts w:ascii="Times New Roman" w:hAnsi="Times New Roman" w:cs="Times New Roman"/>
+          <w:color w:val="000000"/>
+          <w:position w:val="-16"/>
+          <w:sz w:val="26"/>
+          <w:szCs w:val="26"/>
+        </w:rPr>
+        <w:object w:dxaOrig="720" w:dyaOrig="440" w14:anchorId="39E9E398">
           <v:shape id="_x0000_i1025" type="#_x0000_t75" style="width:36pt;height:22pt" o:ole="">
             <v:imagedata r:id="rId5" o:title=""/>
           </v:shape>
-          <o:OLEObject Type="Embed" ProgID="Equation.DSMT4" ShapeID="_x0000_i1025" DrawAspect="Content" ObjectID="_1838466105" r:id="rId6"/>
+          <o:OLEObject Type="Embed" ProgID="Equation.DSMT4" ShapeID="_x0000_i1025" DrawAspect="Content" ObjectID="_1838500474" r:id="rId21"/>
         </w:object>
       </w:r>
       <w:r>
@@ -260,11 +612,11 @@
           <w:sz w:val="26"/>
           <w:szCs w:val="26"/>
         </w:rPr>
-        <w:object w:dxaOrig="840" w:dyaOrig="440" w14:anchorId="51177B5B">
+        <w:object w:dxaOrig="840" w:dyaOrig="440" w14:anchorId="5CCD00D4">
           <v:shape id="_x0000_i1026" type="#_x0000_t75" style="width:42pt;height:22pt" o:ole="">
             <v:imagedata r:id="rId7" o:title=""/>
           </v:shape>
-          <o:OLEObject Type="Embed" ProgID="Equation.DSMT4" ShapeID="_x0000_i1026" DrawAspect="Content" ObjectID="_1838466106" r:id="rId8"/>
+          <o:OLEObject Type="Embed" ProgID="Equation.DSMT4" ShapeID="_x0000_i1026" DrawAspect="Content" ObjectID="_1838500475" r:id="rId22"/>
         </w:object>
       </w:r>
       <w:r>
@@ -314,11 +666,11 @@
           <w:sz w:val="26"/>
           <w:szCs w:val="26"/>
         </w:rPr>
-        <w:object w:dxaOrig="720" w:dyaOrig="440" w14:anchorId="0CE444DA">
+        <w:object w:dxaOrig="720" w:dyaOrig="440" w14:anchorId="3FA5B136">
           <v:shape id="_x0000_i1027" type="#_x0000_t75" style="width:36pt;height:22pt" o:ole="">
             <v:imagedata r:id="rId9" o:title=""/>
           </v:shape>
-          <o:OLEObject Type="Embed" ProgID="Equation.DSMT4" ShapeID="_x0000_i1027" DrawAspect="Content" ObjectID="_1838466107" r:id="rId10"/>
+          <o:OLEObject Type="Embed" ProgID="Equation.DSMT4" ShapeID="_x0000_i1027" DrawAspect="Content" ObjectID="_1838500476" r:id="rId23"/>
         </w:object>
       </w:r>
       <w:r>
@@ -338,11 +690,11 @@
           <w:sz w:val="26"/>
           <w:szCs w:val="26"/>
         </w:rPr>
-        <w:object w:dxaOrig="620" w:dyaOrig="440" w14:anchorId="2C321D2A">
+        <w:object w:dxaOrig="620" w:dyaOrig="440" w14:anchorId="528C498B">
           <v:shape id="_x0000_i1028" type="#_x0000_t75" style="width:31pt;height:22pt" o:ole="">
             <v:imagedata r:id="rId11" o:title=""/>
           </v:shape>
-          <o:OLEObject Type="Embed" ProgID="Equation.DSMT4" ShapeID="_x0000_i1028" DrawAspect="Content" ObjectID="_1838466108" r:id="rId12"/>
+          <o:OLEObject Type="Embed" ProgID="Equation.DSMT4" ShapeID="_x0000_i1028" DrawAspect="Content" ObjectID="_1838500477" r:id="rId24"/>
         </w:object>
       </w:r>
       <w:r>
@@ -372,6 +724,7 @@
           <w:sz w:val="26"/>
           <w:szCs w:val="26"/>
         </w:rPr>
+        <w:lastRenderedPageBreak/>
         <w:tab/>
         <w:t xml:space="preserve">C. </w:t>
       </w:r>
@@ -392,11 +745,11 @@
           <w:sz w:val="26"/>
           <w:szCs w:val="26"/>
         </w:rPr>
-        <w:object w:dxaOrig="620" w:dyaOrig="440" w14:anchorId="1995900E">
+        <w:object w:dxaOrig="620" w:dyaOrig="440" w14:anchorId="6AEE4D09">
           <v:shape id="_x0000_i1029" type="#_x0000_t75" style="width:31pt;height:22pt" o:ole="">
             <v:imagedata r:id="rId13" o:title=""/>
           </v:shape>
-          <o:OLEObject Type="Embed" ProgID="Equation.DSMT4" ShapeID="_x0000_i1029" DrawAspect="Content" ObjectID="_1838466109" r:id="rId14"/>
+          <o:OLEObject Type="Embed" ProgID="Equation.DSMT4" ShapeID="_x0000_i1029" DrawAspect="Content" ObjectID="_1838500478" r:id="rId25"/>
         </w:object>
       </w:r>
       <w:r>
@@ -416,11 +769,11 @@
           <w:sz w:val="26"/>
           <w:szCs w:val="26"/>
         </w:rPr>
-        <w:object w:dxaOrig="840" w:dyaOrig="440" w14:anchorId="19C41A9E">
+        <w:object w:dxaOrig="840" w:dyaOrig="440" w14:anchorId="530E2F8E">
           <v:shape id="_x0000_i1030" type="#_x0000_t75" style="width:42pt;height:22pt" o:ole="">
             <v:imagedata r:id="rId15" o:title=""/>
           </v:shape>
-          <o:OLEObject Type="Embed" ProgID="Equation.DSMT4" ShapeID="_x0000_i1030" DrawAspect="Content" ObjectID="_1838466110" r:id="rId16"/>
+          <o:OLEObject Type="Embed" ProgID="Equation.DSMT4" ShapeID="_x0000_i1030" DrawAspect="Content" ObjectID="_1838500479" r:id="rId26"/>
         </w:object>
       </w:r>
       <w:r>
@@ -439,8 +792,11 @@
           <w:tab w:val="left" w:pos="283"/>
         </w:tabs>
         <w:rPr>
-          <w:sz w:val="26"/>
-          <w:szCs w:val="26"/>
+          <w:rFonts w:ascii="Times New Roman" w:eastAsia="Georgia" w:hAnsi="Times New Roman" w:cs="Times New Roman"/>
+          <w:color w:val="000000"/>
+          <w:sz w:val="26"/>
+          <w:szCs w:val="26"/>
+          <w:lang w:val="vi-VN"/>
         </w:rPr>
       </w:pPr>
       <w:r>
@@ -470,11 +826,11 @@
           <w:sz w:val="26"/>
           <w:szCs w:val="26"/>
         </w:rPr>
-        <w:object w:dxaOrig="840" w:dyaOrig="440" w14:anchorId="133DD55A">
+        <w:object w:dxaOrig="840" w:dyaOrig="440" w14:anchorId="624339F8">
           <v:shape id="_x0000_i1031" type="#_x0000_t75" style="width:42pt;height:22pt" o:ole="">
             <v:imagedata r:id="rId17" o:title=""/>
           </v:shape>
-          <o:OLEObject Type="Embed" ProgID="Equation.DSMT4" ShapeID="_x0000_i1031" DrawAspect="Content" ObjectID="_1838466111" r:id="rId18"/>
+          <o:OLEObject Type="Embed" ProgID="Equation.DSMT4" ShapeID="_x0000_i1031" DrawAspect="Content" ObjectID="_1838500480" r:id="rId27"/>
         </w:object>
       </w:r>
       <w:r>
@@ -494,11 +850,11 @@
           <w:sz w:val="26"/>
           <w:szCs w:val="26"/>
         </w:rPr>
-        <w:object w:dxaOrig="720" w:dyaOrig="440" w14:anchorId="462E88C7">
+        <w:object w:dxaOrig="720" w:dyaOrig="440" w14:anchorId="4813C1B3">
           <v:shape id="_x0000_i1032" type="#_x0000_t75" style="width:36pt;height:22pt" o:ole="">
             <v:imagedata r:id="rId19" o:title=""/>
           </v:shape>
-          <o:OLEObject Type="Embed" ProgID="Equation.DSMT4" ShapeID="_x0000_i1032" DrawAspect="Content" ObjectID="_1838466112" r:id="rId20"/>
+          <o:OLEObject Type="Embed" ProgID="Equation.DSMT4" ShapeID="_x0000_i1032" DrawAspect="Content" ObjectID="_1838500481" r:id="rId28"/>
         </w:object>
       </w:r>
       <w:r>
@@ -510,6 +866,31 @@
         </w:rPr>
         <w:t xml:space="preserve"> làm chuẩn.</w:t>
       </w:r>
+    </w:p>
+    <w:p>
+      <w:pPr>
+        <w:rPr>
+          <w:lang w:val="vi-VN"/>
+        </w:rPr>
+      </w:pPr>
+      <w:r>
+        <w:rPr>
+          <w:lang w:val="vi-VN"/>
+        </w:rPr>
+        <w:t>Đáp án: A,B</w:t>
+      </w:r>
+    </w:p>
+    <w:p>
+      <w:pPr>
+        <w:tabs>
+          <w:tab w:val="left" w:pos="283"/>
+        </w:tabs>
+        <w:rPr>
+          <w:sz w:val="26"/>
+          <w:szCs w:val="26"/>
+          <w:lang w:val="vi-VN"/>
+        </w:rPr>
+      </w:pPr>
     </w:p>
     <w:p>
       <w:pPr>
@@ -1209,6 +1590,7 @@
   <w:style w:type="paragraph" w:default="1" w:styleId="Normal">
     <w:name w:val="Normal"/>
     <w:qFormat/>
+    <w:rsid w:val="00B6525A"/>
   </w:style>
   <w:style w:type="paragraph" w:styleId="Heading1">
     <w:name w:val="heading 1"/>

</xml_diff>

<commit_message>
feat(UI,UX): sửa UI,UI trang theo dõi đề thi của sinh viên và trang tạo, chỉnh sửa, xem chi tiết instance của giáo viên
</commit_message>
<xml_diff>
--- a/backend/de_thi_toan_ki_1.docx
+++ b/backend/de_thi_toan_ki_1.docx
@@ -130,6 +130,26 @@
         </w:rPr>
         <w:tab/>
         <w:t>D. 7</w:t>
+      </w:r>
+    </w:p>
+    <w:p>
+      <w:pPr>
+        <w:rPr>
+          <w:lang w:val="vi-VN"/>
+        </w:rPr>
+      </w:pPr>
+      <w:r>
+        <w:rPr>
+          <w:lang w:val="vi-VN"/>
+        </w:rPr>
+        <w:t>Câu 3: thủ đô của việt nam là gì?</w:t>
+      </w:r>
+      <w:r>
+        <w:rPr>
+          <w:lang w:val="vi-VN"/>
+        </w:rPr>
+        <w:br/>
+        <w:t>đáp án: hà nội</w:t>
       </w:r>
     </w:p>
     <w:p>
@@ -238,10 +258,10 @@
             <v:path o:extrusionok="f" gradientshapeok="t" o:connecttype="rect"/>
             <o:lock v:ext="edit" aspectratio="t"/>
           </v:shapetype>
-          <v:shape id="_x0000_i1081" type="#_x0000_t75" style="width:36pt;height:22pt" o:ole="">
+          <v:shape id="_x0000_i1025" type="#_x0000_t75" style="width:36pt;height:22pt" o:ole="">
             <v:imagedata r:id="rId5" o:title=""/>
           </v:shape>
-          <o:OLEObject Type="Embed" ProgID="Equation.DSMT4" ShapeID="_x0000_i1081" DrawAspect="Content" ObjectID="_1838500466" r:id="rId6"/>
+          <o:OLEObject Type="Embed" ProgID="Equation.DSMT4" ShapeID="_x0000_i1025" DrawAspect="Content" ObjectID="_1839673204" r:id="rId6"/>
         </w:object>
       </w:r>
       <w:r>
@@ -262,10 +282,10 @@
           <w:szCs w:val="26"/>
         </w:rPr>
         <w:object w:dxaOrig="840" w:dyaOrig="440" w14:anchorId="2954EB1C">
-          <v:shape id="_x0000_i1082" type="#_x0000_t75" style="width:42pt;height:22pt" o:ole="">
+          <v:shape id="_x0000_i1026" type="#_x0000_t75" style="width:42pt;height:22pt" o:ole="">
             <v:imagedata r:id="rId7" o:title=""/>
           </v:shape>
-          <o:OLEObject Type="Embed" ProgID="Equation.DSMT4" ShapeID="_x0000_i1082" DrawAspect="Content" ObjectID="_1838500467" r:id="rId8"/>
+          <o:OLEObject Type="Embed" ProgID="Equation.DSMT4" ShapeID="_x0000_i1026" DrawAspect="Content" ObjectID="_1839673205" r:id="rId8"/>
         </w:object>
       </w:r>
       <w:r>
@@ -316,10 +336,10 @@
           <w:szCs w:val="26"/>
         </w:rPr>
         <w:object w:dxaOrig="720" w:dyaOrig="440" w14:anchorId="39CC5C40">
-          <v:shape id="_x0000_i1083" type="#_x0000_t75" style="width:36pt;height:22pt" o:ole="">
+          <v:shape id="_x0000_i1027" type="#_x0000_t75" style="width:36pt;height:22pt" o:ole="">
             <v:imagedata r:id="rId9" o:title=""/>
           </v:shape>
-          <o:OLEObject Type="Embed" ProgID="Equation.DSMT4" ShapeID="_x0000_i1083" DrawAspect="Content" ObjectID="_1838500468" r:id="rId10"/>
+          <o:OLEObject Type="Embed" ProgID="Equation.DSMT4" ShapeID="_x0000_i1027" DrawAspect="Content" ObjectID="_1839673206" r:id="rId10"/>
         </w:object>
       </w:r>
       <w:r>
@@ -340,10 +360,10 @@
           <w:szCs w:val="26"/>
         </w:rPr>
         <w:object w:dxaOrig="620" w:dyaOrig="440" w14:anchorId="6FFBDD3C">
-          <v:shape id="_x0000_i1084" type="#_x0000_t75" style="width:31pt;height:22pt" o:ole="">
+          <v:shape id="_x0000_i1028" type="#_x0000_t75" style="width:31pt;height:22pt" o:ole="">
             <v:imagedata r:id="rId11" o:title=""/>
           </v:shape>
-          <o:OLEObject Type="Embed" ProgID="Equation.DSMT4" ShapeID="_x0000_i1084" DrawAspect="Content" ObjectID="_1838500469" r:id="rId12"/>
+          <o:OLEObject Type="Embed" ProgID="Equation.DSMT4" ShapeID="_x0000_i1028" DrawAspect="Content" ObjectID="_1839673207" r:id="rId12"/>
         </w:object>
       </w:r>
       <w:r>
@@ -394,10 +414,10 @@
           <w:szCs w:val="26"/>
         </w:rPr>
         <w:object w:dxaOrig="620" w:dyaOrig="440" w14:anchorId="2C634CC5">
-          <v:shape id="_x0000_i1085" type="#_x0000_t75" style="width:31pt;height:22pt" o:ole="">
+          <v:shape id="_x0000_i1029" type="#_x0000_t75" style="width:31pt;height:22pt" o:ole="">
             <v:imagedata r:id="rId13" o:title=""/>
           </v:shape>
-          <o:OLEObject Type="Embed" ProgID="Equation.DSMT4" ShapeID="_x0000_i1085" DrawAspect="Content" ObjectID="_1838500470" r:id="rId14"/>
+          <o:OLEObject Type="Embed" ProgID="Equation.DSMT4" ShapeID="_x0000_i1029" DrawAspect="Content" ObjectID="_1839673208" r:id="rId14"/>
         </w:object>
       </w:r>
       <w:r>
@@ -418,10 +438,10 @@
           <w:szCs w:val="26"/>
         </w:rPr>
         <w:object w:dxaOrig="840" w:dyaOrig="440" w14:anchorId="7884F2B6">
-          <v:shape id="_x0000_i1086" type="#_x0000_t75" style="width:42pt;height:22pt" o:ole="">
+          <v:shape id="_x0000_i1030" type="#_x0000_t75" style="width:42pt;height:22pt" o:ole="">
             <v:imagedata r:id="rId15" o:title=""/>
           </v:shape>
-          <o:OLEObject Type="Embed" ProgID="Equation.DSMT4" ShapeID="_x0000_i1086" DrawAspect="Content" ObjectID="_1838500471" r:id="rId16"/>
+          <o:OLEObject Type="Embed" ProgID="Equation.DSMT4" ShapeID="_x0000_i1030" DrawAspect="Content" ObjectID="_1839673209" r:id="rId16"/>
         </w:object>
       </w:r>
       <w:r>
@@ -475,10 +495,10 @@
           <w:szCs w:val="26"/>
         </w:rPr>
         <w:object w:dxaOrig="840" w:dyaOrig="440" w14:anchorId="1F602575">
-          <v:shape id="_x0000_i1087" type="#_x0000_t75" style="width:42pt;height:22pt" o:ole="">
+          <v:shape id="_x0000_i1031" type="#_x0000_t75" style="width:42pt;height:22pt" o:ole="">
             <v:imagedata r:id="rId17" o:title=""/>
           </v:shape>
-          <o:OLEObject Type="Embed" ProgID="Equation.DSMT4" ShapeID="_x0000_i1087" DrawAspect="Content" ObjectID="_1838500472" r:id="rId18"/>
+          <o:OLEObject Type="Embed" ProgID="Equation.DSMT4" ShapeID="_x0000_i1031" DrawAspect="Content" ObjectID="_1839673210" r:id="rId18"/>
         </w:object>
       </w:r>
       <w:r>
@@ -499,10 +519,10 @@
           <w:szCs w:val="26"/>
         </w:rPr>
         <w:object w:dxaOrig="720" w:dyaOrig="440" w14:anchorId="4689BE5D">
-          <v:shape id="_x0000_i1088" type="#_x0000_t75" style="width:36pt;height:22pt" o:ole="">
+          <v:shape id="_x0000_i1032" type="#_x0000_t75" style="width:36pt;height:22pt" o:ole="">
             <v:imagedata r:id="rId19" o:title=""/>
           </v:shape>
-          <o:OLEObject Type="Embed" ProgID="Equation.DSMT4" ShapeID="_x0000_i1088" DrawAspect="Content" ObjectID="_1838500473" r:id="rId20"/>
+          <o:OLEObject Type="Embed" ProgID="Equation.DSMT4" ShapeID="_x0000_i1032" DrawAspect="Content" ObjectID="_1839673211" r:id="rId20"/>
         </w:object>
       </w:r>
       <w:r>
@@ -589,10 +609,10 @@
           <w:szCs w:val="26"/>
         </w:rPr>
         <w:object w:dxaOrig="720" w:dyaOrig="440" w14:anchorId="39E9E398">
-          <v:shape id="_x0000_i1025" type="#_x0000_t75" style="width:36pt;height:22pt" o:ole="">
+          <v:shape id="_x0000_i1033" type="#_x0000_t75" style="width:36pt;height:22pt" o:ole="">
             <v:imagedata r:id="rId5" o:title=""/>
           </v:shape>
-          <o:OLEObject Type="Embed" ProgID="Equation.DSMT4" ShapeID="_x0000_i1025" DrawAspect="Content" ObjectID="_1838500474" r:id="rId21"/>
+          <o:OLEObject Type="Embed" ProgID="Equation.DSMT4" ShapeID="_x0000_i1033" DrawAspect="Content" ObjectID="_1839673212" r:id="rId21"/>
         </w:object>
       </w:r>
       <w:r>
@@ -613,10 +633,10 @@
           <w:szCs w:val="26"/>
         </w:rPr>
         <w:object w:dxaOrig="840" w:dyaOrig="440" w14:anchorId="5CCD00D4">
-          <v:shape id="_x0000_i1026" type="#_x0000_t75" style="width:42pt;height:22pt" o:ole="">
+          <v:shape id="_x0000_i1034" type="#_x0000_t75" style="width:42pt;height:22pt" o:ole="">
             <v:imagedata r:id="rId7" o:title=""/>
           </v:shape>
-          <o:OLEObject Type="Embed" ProgID="Equation.DSMT4" ShapeID="_x0000_i1026" DrawAspect="Content" ObjectID="_1838500475" r:id="rId22"/>
+          <o:OLEObject Type="Embed" ProgID="Equation.DSMT4" ShapeID="_x0000_i1034" DrawAspect="Content" ObjectID="_1839673213" r:id="rId22"/>
         </w:object>
       </w:r>
       <w:r>
@@ -646,6 +666,7 @@
           <w:sz w:val="26"/>
           <w:szCs w:val="26"/>
         </w:rPr>
+        <w:lastRenderedPageBreak/>
         <w:tab/>
         <w:t xml:space="preserve">B. </w:t>
       </w:r>
@@ -667,10 +688,10 @@
           <w:szCs w:val="26"/>
         </w:rPr>
         <w:object w:dxaOrig="720" w:dyaOrig="440" w14:anchorId="3FA5B136">
-          <v:shape id="_x0000_i1027" type="#_x0000_t75" style="width:36pt;height:22pt" o:ole="">
+          <v:shape id="_x0000_i1035" type="#_x0000_t75" style="width:36pt;height:22pt" o:ole="">
             <v:imagedata r:id="rId9" o:title=""/>
           </v:shape>
-          <o:OLEObject Type="Embed" ProgID="Equation.DSMT4" ShapeID="_x0000_i1027" DrawAspect="Content" ObjectID="_1838500476" r:id="rId23"/>
+          <o:OLEObject Type="Embed" ProgID="Equation.DSMT4" ShapeID="_x0000_i1035" DrawAspect="Content" ObjectID="_1839673214" r:id="rId23"/>
         </w:object>
       </w:r>
       <w:r>
@@ -691,10 +712,10 @@
           <w:szCs w:val="26"/>
         </w:rPr>
         <w:object w:dxaOrig="620" w:dyaOrig="440" w14:anchorId="528C498B">
-          <v:shape id="_x0000_i1028" type="#_x0000_t75" style="width:31pt;height:22pt" o:ole="">
+          <v:shape id="_x0000_i1036" type="#_x0000_t75" style="width:31pt;height:22pt" o:ole="">
             <v:imagedata r:id="rId11" o:title=""/>
           </v:shape>
-          <o:OLEObject Type="Embed" ProgID="Equation.DSMT4" ShapeID="_x0000_i1028" DrawAspect="Content" ObjectID="_1838500477" r:id="rId24"/>
+          <o:OLEObject Type="Embed" ProgID="Equation.DSMT4" ShapeID="_x0000_i1036" DrawAspect="Content" ObjectID="_1839673215" r:id="rId24"/>
         </w:object>
       </w:r>
       <w:r>
@@ -724,7 +745,6 @@
           <w:sz w:val="26"/>
           <w:szCs w:val="26"/>
         </w:rPr>
-        <w:lastRenderedPageBreak/>
         <w:tab/>
         <w:t xml:space="preserve">C. </w:t>
       </w:r>
@@ -746,10 +766,10 @@
           <w:szCs w:val="26"/>
         </w:rPr>
         <w:object w:dxaOrig="620" w:dyaOrig="440" w14:anchorId="6AEE4D09">
-          <v:shape id="_x0000_i1029" type="#_x0000_t75" style="width:31pt;height:22pt" o:ole="">
+          <v:shape id="_x0000_i1037" type="#_x0000_t75" style="width:31pt;height:22pt" o:ole="">
             <v:imagedata r:id="rId13" o:title=""/>
           </v:shape>
-          <o:OLEObject Type="Embed" ProgID="Equation.DSMT4" ShapeID="_x0000_i1029" DrawAspect="Content" ObjectID="_1838500478" r:id="rId25"/>
+          <o:OLEObject Type="Embed" ProgID="Equation.DSMT4" ShapeID="_x0000_i1037" DrawAspect="Content" ObjectID="_1839673216" r:id="rId25"/>
         </w:object>
       </w:r>
       <w:r>
@@ -770,10 +790,10 @@
           <w:szCs w:val="26"/>
         </w:rPr>
         <w:object w:dxaOrig="840" w:dyaOrig="440" w14:anchorId="530E2F8E">
-          <v:shape id="_x0000_i1030" type="#_x0000_t75" style="width:42pt;height:22pt" o:ole="">
+          <v:shape id="_x0000_i1038" type="#_x0000_t75" style="width:42pt;height:22pt" o:ole="">
             <v:imagedata r:id="rId15" o:title=""/>
           </v:shape>
-          <o:OLEObject Type="Embed" ProgID="Equation.DSMT4" ShapeID="_x0000_i1030" DrawAspect="Content" ObjectID="_1838500479" r:id="rId26"/>
+          <o:OLEObject Type="Embed" ProgID="Equation.DSMT4" ShapeID="_x0000_i1038" DrawAspect="Content" ObjectID="_1839673217" r:id="rId26"/>
         </w:object>
       </w:r>
       <w:r>
@@ -827,10 +847,10 @@
           <w:szCs w:val="26"/>
         </w:rPr>
         <w:object w:dxaOrig="840" w:dyaOrig="440" w14:anchorId="624339F8">
-          <v:shape id="_x0000_i1031" type="#_x0000_t75" style="width:42pt;height:22pt" o:ole="">
+          <v:shape id="_x0000_i1039" type="#_x0000_t75" style="width:42pt;height:22pt" o:ole="">
             <v:imagedata r:id="rId17" o:title=""/>
           </v:shape>
-          <o:OLEObject Type="Embed" ProgID="Equation.DSMT4" ShapeID="_x0000_i1031" DrawAspect="Content" ObjectID="_1838500480" r:id="rId27"/>
+          <o:OLEObject Type="Embed" ProgID="Equation.DSMT4" ShapeID="_x0000_i1039" DrawAspect="Content" ObjectID="_1839673218" r:id="rId27"/>
         </w:object>
       </w:r>
       <w:r>
@@ -851,10 +871,10 @@
           <w:szCs w:val="26"/>
         </w:rPr>
         <w:object w:dxaOrig="720" w:dyaOrig="440" w14:anchorId="4813C1B3">
-          <v:shape id="_x0000_i1032" type="#_x0000_t75" style="width:36pt;height:22pt" o:ole="">
+          <v:shape id="_x0000_i1040" type="#_x0000_t75" style="width:36pt;height:22pt" o:ole="">
             <v:imagedata r:id="rId19" o:title=""/>
           </v:shape>
-          <o:OLEObject Type="Embed" ProgID="Equation.DSMT4" ShapeID="_x0000_i1032" DrawAspect="Content" ObjectID="_1838500481" r:id="rId28"/>
+          <o:OLEObject Type="Embed" ProgID="Equation.DSMT4" ShapeID="_x0000_i1040" DrawAspect="Content" ObjectID="_1839673219" r:id="rId28"/>
         </w:object>
       </w:r>
       <w:r>

</xml_diff>